<commit_message>
Update user guide and screenshots for v1.1
Adds Version strategy explanation to Step 4 of the user guide (Preserve
metadata vs Keep sequential, with a Note callout on the tradeoff).
Regenerates all screenshots and the UserGuide.docx. Removes stale
check_state.png debug screenshot.

Co-Authored-By: Claude Sonnet 4.6 <noreply@anthropic.com>
</commit_message>
<xml_diff>
--- a/SharePointSmartCopy/Docs/SharePointSmartCopy_UserGuide.docx
+++ b/SharePointSmartCopy/Docs/SharePointSmartCopy_UserGuide.docx
@@ -102,7 +102,7 @@
           <w:sz w:val="18"/>
           <w:color w:val="A19F9D"/>
         </w:rPr>
-        <w:t>Version 1.0  ·  May 2026</w:t>
+        <w:t>Version 1.1  ·  May 2026</w:t>
       </w:r>
     </w:p>
     <w:p>
@@ -1240,7 +1240,7 @@
                     <pic:cNvPicPr/>
                   </pic:nvPicPr>
                   <pic:blipFill>
-                    <a:blip xmlns:r="http://schemas.openxmlformats.org/officeDocument/2006/relationships" r:embed="Rceb0140227394b76"/>
+                    <a:blip xmlns:r="http://schemas.openxmlformats.org/officeDocument/2006/relationships" r:embed="R7a0233668134458b"/>
                     <a:stretch>
                       <a:fillRect/>
                     </a:stretch>
@@ -1556,7 +1556,7 @@
                     <pic:cNvPicPr/>
                   </pic:nvPicPr>
                   <pic:blipFill>
-                    <a:blip xmlns:r="http://schemas.openxmlformats.org/officeDocument/2006/relationships" r:embed="R8a8bc2174caa4407"/>
+                    <a:blip xmlns:r="http://schemas.openxmlformats.org/officeDocument/2006/relationships" r:embed="R5bfb0bb569b9466e"/>
                     <a:stretch>
                       <a:fillRect/>
                     </a:stretch>
@@ -1654,7 +1654,7 @@
                     <pic:cNvPicPr/>
                   </pic:nvPicPr>
                   <pic:blipFill>
-                    <a:blip xmlns:r="http://schemas.openxmlformats.org/officeDocument/2006/relationships" r:embed="R320a939668fb4a9a"/>
+                    <a:blip xmlns:r="http://schemas.openxmlformats.org/officeDocument/2006/relationships" r:embed="Rb6d99eceb55d43f2"/>
                     <a:stretch>
                       <a:fillRect/>
                     </a:stretch>
@@ -1840,7 +1840,7 @@
                     <pic:cNvPicPr/>
                   </pic:nvPicPr>
                   <pic:blipFill>
-                    <a:blip xmlns:r="http://schemas.openxmlformats.org/officeDocument/2006/relationships" r:embed="R5adb1a40772e483d"/>
+                    <a:blip xmlns:r="http://schemas.openxmlformats.org/officeDocument/2006/relationships" r:embed="R80180583f4974be2"/>
                     <a:stretch>
                       <a:fillRect/>
                     </a:stretch>
@@ -1951,7 +1951,7 @@
                     <pic:cNvPicPr/>
                   </pic:nvPicPr>
                   <pic:blipFill>
-                    <a:blip xmlns:r="http://schemas.openxmlformats.org/officeDocument/2006/relationships" r:embed="R579eb07ae4144744"/>
+                    <a:blip xmlns:r="http://schemas.openxmlformats.org/officeDocument/2006/relationships" r:embed="R32310454003842e1"/>
                     <a:stretch>
                       <a:fillRect/>
                     </a:stretch>
@@ -2088,7 +2088,7 @@
                     <pic:cNvPicPr/>
                   </pic:nvPicPr>
                   <pic:blipFill>
-                    <a:blip xmlns:r="http://schemas.openxmlformats.org/officeDocument/2006/relationships" r:embed="R5e96ac770e374649"/>
+                    <a:blip xmlns:r="http://schemas.openxmlformats.org/officeDocument/2006/relationships" r:embed="R97da556a080d4bbc"/>
                     <a:stretch>
                       <a:fillRect/>
                     </a:stretch>
@@ -2178,6 +2178,90 @@
           <w:sz w:val="22"/>
           <w:color w:val="323130"/>
         </w:rPr>
+        <w:t xml:space="preserve">When version copying is enabled, the Version strategy option controls how metadata is applied to each uploaded version:</w:t>
+      </w:r>
+    </w:p>
+    <w:p>
+      <w:pPr>
+        <w:spacing w:before="0" w:after="60" w:line="300" w:lineRule="auto"/>
+        <w:ind w:left="504" w:hanging="252"/>
+      </w:pPr>
+      <w:r>
+        <w:rPr>
+          <w:rFonts w:ascii="Segoe UI" w:hAnsi="Segoe UI"/>
+          <w:sz w:val="22"/>
+          <w:color w:val="0078D4"/>
+        </w:rPr>
+        <w:t xml:space="preserve">•  </w:t>
+      </w:r>
+      <w:r>
+        <w:rPr>
+          <w:rFonts w:ascii="Segoe UI" w:hAnsi="Segoe UI"/>
+          <w:sz w:val="22"/>
+          <w:color w:val="323130"/>
+        </w:rPr>
+        <w:t xml:space="preserve">Preserve metadata for every version — every version in the target shows the source's original Modified date and author. Version numbers will be non-sequential (e.g. 2, 4, 6) due to a SharePoint API constraint that creates a phantom version each time metadata is patched.</w:t>
+      </w:r>
+    </w:p>
+    <w:p>
+      <w:pPr>
+        <w:spacing w:before="0" w:after="60" w:line="300" w:lineRule="auto"/>
+        <w:ind w:left="504" w:hanging="252"/>
+      </w:pPr>
+      <w:r>
+        <w:rPr>
+          <w:rFonts w:ascii="Segoe UI" w:hAnsi="Segoe UI"/>
+          <w:sz w:val="22"/>
+          <w:color w:val="0078D4"/>
+        </w:rPr>
+        <w:t xml:space="preserve">•  </w:t>
+      </w:r>
+      <w:r>
+        <w:rPr>
+          <w:rFonts w:ascii="Segoe UI" w:hAnsi="Segoe UI"/>
+          <w:sz w:val="22"/>
+          <w:color w:val="323130"/>
+        </w:rPr>
+        <w:t xml:space="preserve">Keep version numbers sequential — versions are numbered 1, 2, 3… with no gaps. Only the latest version's metadata (date and author) is synced; intermediate versions show the copy date rather than the original source date.</w:t>
+      </w:r>
+    </w:p>
+    <w:p>
+      <w:pPr>
+        <w:spacing w:before="120" w:after="120"/>
+        <w:ind w:left="504" w:right="504"/>
+        <w:shd w:val="clear" w:fill="EFF6FC"/>
+        <w:pBdr>
+          <w:left w:val="single" w:color="0078D4" w:sz="18"/>
+        </w:pBdr>
+      </w:pPr>
+      <w:r>
+        <w:rPr>
+          <w:rFonts w:ascii="Segoe UI" w:hAnsi="Segoe UI"/>
+          <w:sz w:val="20"/>
+          <w:b/>
+          <w:color w:val="004578"/>
+        </w:rPr>
+        <w:t xml:space="preserve">Note:  </w:t>
+      </w:r>
+      <w:r>
+        <w:rPr>
+          <w:rFonts w:ascii="Segoe UI" w:hAnsi="Segoe UI"/>
+          <w:sz w:val="20"/>
+          <w:color w:val="004578"/>
+        </w:rPr>
+        <w:t xml:space="preserve">Choose 'Preserve metadata' when accurate per-version dates and authors matter most. Choose 'Keep sequential' when clean, gap-free version numbers are the priority.</w:t>
+      </w:r>
+    </w:p>
+    <w:p>
+      <w:pPr>
+        <w:spacing w:before="0" w:after="120" w:line="300" w:lineRule="auto"/>
+      </w:pPr>
+      <w:r>
+        <w:rPr>
+          <w:rFonts w:ascii="Segoe UI" w:hAnsi="Segoe UI"/>
+          <w:sz w:val="22"/>
+          <w:color w:val="323130"/>
+        </w:rPr>
         <w:t xml:space="preserve">The right panel shows a preview of the top-level items to be copied. Click Start Copy → to begin.</w:t>
       </w:r>
     </w:p>
@@ -2230,7 +2314,7 @@
                     <pic:cNvPicPr/>
                   </pic:nvPicPr>
                   <pic:blipFill>
-                    <a:blip xmlns:r="http://schemas.openxmlformats.org/officeDocument/2006/relationships" r:embed="R9bb6c7e6df514964"/>
+                    <a:blip xmlns:r="http://schemas.openxmlformats.org/officeDocument/2006/relationships" r:embed="R5ae20a727f514a0d"/>
                     <a:stretch>
                       <a:fillRect/>
                     </a:stretch>
@@ -2451,7 +2535,7 @@
                     <pic:cNvPicPr/>
                   </pic:nvPicPr>
                   <pic:blipFill>
-                    <a:blip xmlns:r="http://schemas.openxmlformats.org/officeDocument/2006/relationships" r:embed="Rd0c914552e404b55"/>
+                    <a:blip xmlns:r="http://schemas.openxmlformats.org/officeDocument/2006/relationships" r:embed="R1ef6b11079be4de8"/>
                     <a:stretch>
                       <a:fillRect/>
                     </a:stretch>
@@ -2645,7 +2729,7 @@
                     <pic:cNvPicPr/>
                   </pic:nvPicPr>
                   <pic:blipFill>
-                    <a:blip xmlns:r="http://schemas.openxmlformats.org/officeDocument/2006/relationships" r:embed="R56b30d24b4b842da"/>
+                    <a:blip xmlns:r="http://schemas.openxmlformats.org/officeDocument/2006/relationships" r:embed="R7d2b27c37f594050"/>
                     <a:stretch>
                       <a:fillRect/>
                     </a:stretch>
@@ -2716,7 +2800,7 @@
                     <pic:cNvPicPr/>
                   </pic:nvPicPr>
                   <pic:blipFill>
-                    <a:blip xmlns:r="http://schemas.openxmlformats.org/officeDocument/2006/relationships" r:embed="Rc60aaebf230146f1"/>
+                    <a:blip xmlns:r="http://schemas.openxmlformats.org/officeDocument/2006/relationships" r:embed="R1976ab48cc8948f9"/>
                     <a:stretch>
                       <a:fillRect/>
                     </a:stretch>

</xml_diff>